<commit_message>
Move the form code off the letterhead contact block in the footer
The document-control code (AACM-CP-CF-83 / -88 and its version line) in the
footer of the archive, structural/architectural and photo report templates
was printed over the letterhead's phone/e-mail/address block. A new
footer_align sanitize op right-aligns those lines (and drops the grey rule
that crossed the phone number in the photo reports). Templates bumped:
archive v3, str-arch v3, photo reports v2.

Co-Authored-By: Claude Opus 5.5 <noreply@anthropic.com>
Claude-Session: https://claude.ai/code/session_01KhB95Q3CdNoHoGHNq4XQ7x
</commit_message>
<xml_diff>
--- a/templates/dist/archive-drawings-explanation.docx
+++ b/templates/dist/archive-drawings-explanation.docx
@@ -1123,22 +1123,16 @@
   <w:p>
     <w:pPr>
       <w:pStyle w:val="Footer"/>
-      <w:tabs>
-        <w:tab w:val="clear" w:pos="4320"/>
-        <w:tab w:val="clear" w:pos="8640"/>
-        <w:tab w:val="left" w:pos="6090"/>
-      </w:tabs>
+      <w:jc w:val="right"/>
     </w:pPr>
     <w:r>
       <w:t>AACM-CP-CF-83</w:t>
-    </w:r>
-    <w:r>
-      <w:tab/>
     </w:r>
   </w:p>
   <w:p>
     <w:pPr>
       <w:pStyle w:val="Footer"/>
+      <w:jc w:val="right"/>
     </w:pPr>
     <w:r>
       <w:t>V2.0 07 Oct 2022</w:t>

</xml_diff>